<commit_message>
updated the manuscript and supporting info
</commit_message>
<xml_diff>
--- a/manuscript/SUPPORTING_INFORMATION_1.docx
+++ b/manuscript/SUPPORTING_INFORMATION_1.docx
@@ -1438,12 +1438,112 @@
       <w:pPr>
         <w:rPr>
           <w:rFonts w:ascii="Times New Roman" w:hAnsi="Times New Roman" w:cs="Times New Roman"/>
+          <w:b/>
+          <w:bCs/>
         </w:rPr>
       </w:pPr>
       <w:bookmarkStart w:id="8" w:name="X636d3ca42a2e8559fc64501a98954213fe6c4db"/>
       <w:bookmarkStart w:id="9" w:name="s31-sample-to-feature-ratios"/>
       <w:bookmarkEnd w:id="6"/>
       <w:bookmarkEnd w:id="7"/>
+    </w:p>
+    <w:p>
+      <w:pPr>
+        <w:rPr>
+          <w:rFonts w:ascii="Times New Roman" w:hAnsi="Times New Roman" w:cs="Times New Roman"/>
+          <w:b/>
+          <w:bCs/>
+        </w:rPr>
+      </w:pPr>
+      <w:r>
+        <w:rPr>
+          <w:noProof/>
+        </w:rPr>
+        <w:lastRenderedPageBreak/>
+        <w:drawing>
+          <wp:inline distT="0" distB="0" distL="0" distR="0" wp14:anchorId="5AF7BBCC" wp14:editId="67E4B287">
+            <wp:extent cx="5943600" cy="3962400"/>
+            <wp:effectExtent l="0" t="0" r="0" b="0"/>
+            <wp:docPr id="1495032860" name="Picture 1"/>
+            <wp:cNvGraphicFramePr>
+              <a:graphicFrameLocks xmlns:a="http://schemas.openxmlformats.org/drawingml/2006/main" noChangeAspect="1"/>
+            </wp:cNvGraphicFramePr>
+            <a:graphic xmlns:a="http://schemas.openxmlformats.org/drawingml/2006/main">
+              <a:graphicData uri="http://schemas.openxmlformats.org/drawingml/2006/picture">
+                <pic:pic xmlns:pic="http://schemas.openxmlformats.org/drawingml/2006/picture">
+                  <pic:nvPicPr>
+                    <pic:cNvPr id="0" name="Picture 179"/>
+                    <pic:cNvPicPr>
+                      <a:picLocks noChangeAspect="1" noChangeArrowheads="1"/>
+                    </pic:cNvPicPr>
+                  </pic:nvPicPr>
+                  <pic:blipFill>
+                    <a:blip r:embed="rId6" cstate="print">
+                      <a:extLst>
+                        <a:ext uri="{28A0092B-C50C-407E-A947-70E740481C1C}">
+                          <a14:useLocalDpi xmlns:a14="http://schemas.microsoft.com/office/drawing/2010/main" val="0"/>
+                        </a:ext>
+                      </a:extLst>
+                    </a:blip>
+                    <a:srcRect/>
+                    <a:stretch>
+                      <a:fillRect/>
+                    </a:stretch>
+                  </pic:blipFill>
+                  <pic:spPr bwMode="auto">
+                    <a:xfrm>
+                      <a:off x="0" y="0"/>
+                      <a:ext cx="5943600" cy="3962400"/>
+                    </a:xfrm>
+                    <a:prstGeom prst="rect">
+                      <a:avLst/>
+                    </a:prstGeom>
+                    <a:noFill/>
+                    <a:ln>
+                      <a:noFill/>
+                    </a:ln>
+                  </pic:spPr>
+                </pic:pic>
+              </a:graphicData>
+            </a:graphic>
+          </wp:inline>
+        </w:drawing>
+      </w:r>
+    </w:p>
+    <w:p>
+      <w:pPr>
+        <w:rPr>
+          <w:rFonts w:ascii="Times New Roman" w:hAnsi="Times New Roman" w:cs="Times New Roman"/>
+        </w:rPr>
+      </w:pPr>
+      <w:r>
+        <w:rPr>
+          <w:rFonts w:ascii="Times New Roman" w:hAnsi="Times New Roman" w:cs="Times New Roman"/>
+          <w:b/>
+          <w:bCs/>
+        </w:rPr>
+        <w:t xml:space="preserve">Figure S1. </w:t>
+      </w:r>
+      <w:r>
+        <w:rPr>
+          <w:rFonts w:ascii="Times New Roman" w:hAnsi="Times New Roman" w:cs="Times New Roman"/>
+        </w:rPr>
+        <w:t>RFECV cross-validation RMSE versus number of retained features; vertical marker at 31</w:t>
+      </w:r>
+    </w:p>
+    <w:p>
+      <w:pPr>
+        <w:rPr>
+          <w:rFonts w:ascii="Times New Roman" w:hAnsi="Times New Roman" w:cs="Times New Roman"/>
+        </w:rPr>
+      </w:pPr>
+    </w:p>
+    <w:p>
+      <w:pPr>
+        <w:rPr>
+          <w:rFonts w:ascii="Times New Roman" w:hAnsi="Times New Roman" w:cs="Times New Roman"/>
+        </w:rPr>
+      </w:pPr>
       <w:r>
         <w:rPr>
           <w:rFonts w:ascii="Times New Roman" w:hAnsi="Times New Roman" w:cs="Times New Roman"/>
@@ -1637,7 +1737,6 @@
               <w:rPr>
                 <w:rFonts w:ascii="Times New Roman" w:hAnsi="Times New Roman" w:cs="Times New Roman"/>
               </w:rPr>
-              <w:lastRenderedPageBreak/>
               <w:t>SelectFromModel (canonical)</w:t>
             </w:r>
           </w:p>
@@ -2285,6 +2384,7 @@
                 <w:rStyle w:val="VerbatimChar"/>
                 <w:rFonts w:ascii="Times New Roman" w:hAnsi="Times New Roman" w:cs="Times New Roman"/>
               </w:rPr>
+              <w:lastRenderedPageBreak/>
               <w:t>7</w:t>
             </w:r>
           </w:p>
@@ -3786,7 +3886,6 @@
                 <w:szCs w:val="22"/>
                 <w:lang w:val="en-IN" w:eastAsia="en-IN"/>
               </w:rPr>
-              <w:lastRenderedPageBreak/>
               <w:t>16</w:t>
             </w:r>
           </w:p>
@@ -4785,6 +4884,7 @@
                 <w:szCs w:val="22"/>
                 <w:lang w:val="en-IN" w:eastAsia="en-IN"/>
               </w:rPr>
+              <w:lastRenderedPageBreak/>
               <w:t>31</w:t>
             </w:r>
           </w:p>
@@ -6364,7 +6464,6 @@
           <w:b/>
           <w:bCs/>
         </w:rPr>
-        <w:lastRenderedPageBreak/>
         <w:t>Table S8</w:t>
       </w:r>
       <w:r>
@@ -7303,6 +7402,7 @@
                 <w:b/>
                 <w:bCs/>
               </w:rPr>
+              <w:lastRenderedPageBreak/>
               <w:t>add_hydrogens_tuned_select_from_model</w:t>
             </w:r>
           </w:p>
@@ -8578,7 +8678,6 @@
                 <w:i/>
                 <w:iCs/>
               </w:rPr>
-              <w:lastRenderedPageBreak/>
               <w:t>R²</w:t>
             </w:r>
           </w:p>

</xml_diff>